<commit_message>
Add responsive nav, srcset images, resize helper, and updated README
</commit_message>
<xml_diff>
--- a/document/WEDE5020.docx
+++ b/document/WEDE5020.docx
@@ -73,10 +73,7 @@
         <w:jc w:val="center"/>
       </w:pPr>
       <w:r>
-        <w:t xml:space="preserve">WEDE5020 – Web </w:t>
-      </w:r>
-      <w:r>
-        <w:t>Development (introduction)</w:t>
+        <w:t>WEDE5020 – Web Development (introduction)</w:t>
       </w:r>
     </w:p>
     <w:p>
@@ -189,6 +186,15 @@
     </w:p>
     <w:sdt>
       <w:sdtPr>
+        <w:rPr>
+          <w:rFonts w:asciiTheme="minorHAnsi" w:eastAsiaTheme="minorHAnsi" w:hAnsiTheme="minorHAnsi" w:cstheme="minorBidi"/>
+          <w:color w:val="auto"/>
+          <w:kern w:val="2"/>
+          <w:sz w:val="24"/>
+          <w:szCs w:val="24"/>
+          <w:lang w:val="en-ZA"/>
+          <w14:ligatures w14:val="standardContextual"/>
+        </w:rPr>
         <w:id w:val="2034220209"/>
         <w:docPartObj>
           <w:docPartGallery w:val="Table of Contents"/>
@@ -197,16 +203,9 @@
       </w:sdtPr>
       <w:sdtEndPr>
         <w:rPr>
-          <w:rFonts w:asciiTheme="minorHAnsi" w:eastAsiaTheme="minorHAnsi" w:hAnsiTheme="minorHAnsi" w:cstheme="minorBidi"/>
           <w:b/>
           <w:bCs/>
           <w:noProof/>
-          <w:color w:val="auto"/>
-          <w:kern w:val="2"/>
-          <w:sz w:val="24"/>
-          <w:szCs w:val="24"/>
-          <w:lang w:val="en-ZA"/>
-          <w14:ligatures w14:val="standardContextual"/>
         </w:rPr>
       </w:sdtEndPr>
       <w:sdtContent>
@@ -239,7 +238,7 @@
           <w:r>
             <w:fldChar w:fldCharType="separate"/>
           </w:r>
-          <w:hyperlink w:anchor="_Toc237640585" w:history="1">
+          <w:hyperlink w:anchor="_Toc237642963" w:history="1">
             <w:r>
               <w:rPr>
                 <w:rStyle w:val="Hyperlink"/>
@@ -266,7 +265,7 @@
                 <w:noProof/>
                 <w:webHidden/>
               </w:rPr>
-              <w:instrText xml:space="preserve"> PAGEREF _Toc237640585 \h </w:instrText>
+              <w:instrText xml:space="preserve"> PAGEREF _Toc237642963 \h </w:instrText>
             </w:r>
             <w:r>
               <w:rPr>
@@ -309,7 +308,7 @@
               <w:lang w:eastAsia="en-ZA"/>
             </w:rPr>
           </w:pPr>
-          <w:hyperlink w:anchor="_Toc237640586" w:history="1">
+          <w:hyperlink w:anchor="_Toc237642964" w:history="1">
             <w:r>
               <w:rPr>
                 <w:rStyle w:val="Hyperlink"/>
@@ -336,7 +335,7 @@
                 <w:noProof/>
                 <w:webHidden/>
               </w:rPr>
-              <w:instrText xml:space="preserve"> PAGEREF _Toc237640586 \h </w:instrText>
+              <w:instrText xml:space="preserve"> PAGEREF _Toc237642964 \h </w:instrText>
             </w:r>
             <w:r>
               <w:rPr>
@@ -379,7 +378,7 @@
               <w:lang w:eastAsia="en-ZA"/>
             </w:rPr>
           </w:pPr>
-          <w:hyperlink w:anchor="_Toc237640587" w:history="1">
+          <w:hyperlink w:anchor="_Toc237642965" w:history="1">
             <w:r>
               <w:rPr>
                 <w:rStyle w:val="Hyperlink"/>
@@ -406,7 +405,7 @@
                 <w:noProof/>
                 <w:webHidden/>
               </w:rPr>
-              <w:instrText xml:space="preserve"> PAGEREF _Toc237640587 \h </w:instrText>
+              <w:instrText xml:space="preserve"> PAGEREF _Toc237642965 \h </w:instrText>
             </w:r>
             <w:r>
               <w:rPr>
@@ -449,7 +448,7 @@
               <w:lang w:eastAsia="en-ZA"/>
             </w:rPr>
           </w:pPr>
-          <w:hyperlink w:anchor="_Toc237640588" w:history="1">
+          <w:hyperlink w:anchor="_Toc237642966" w:history="1">
             <w:r>
               <w:rPr>
                 <w:rStyle w:val="Hyperlink"/>
@@ -476,7 +475,7 @@
                 <w:noProof/>
                 <w:webHidden/>
               </w:rPr>
-              <w:instrText xml:space="preserve"> PAGEREF _Toc237640588 \h </w:instrText>
+              <w:instrText xml:space="preserve"> PAGEREF _Toc237642966 \h </w:instrText>
             </w:r>
             <w:r>
               <w:rPr>
@@ -519,7 +518,7 @@
               <w:lang w:eastAsia="en-ZA"/>
             </w:rPr>
           </w:pPr>
-          <w:hyperlink w:anchor="_Toc237640589" w:history="1">
+          <w:hyperlink w:anchor="_Toc237642967" w:history="1">
             <w:r>
               <w:rPr>
                 <w:rStyle w:val="Hyperlink"/>
@@ -546,7 +545,7 @@
                 <w:noProof/>
                 <w:webHidden/>
               </w:rPr>
-              <w:instrText xml:space="preserve"> PAGEREF _Toc237640589 \h </w:instrText>
+              <w:instrText xml:space="preserve"> PAGEREF _Toc237642967 \h </w:instrText>
             </w:r>
             <w:r>
               <w:rPr>
@@ -589,7 +588,7 @@
               <w:lang w:eastAsia="en-ZA"/>
             </w:rPr>
           </w:pPr>
-          <w:hyperlink w:anchor="_Toc237640590" w:history="1">
+          <w:hyperlink w:anchor="_Toc237642968" w:history="1">
             <w:r>
               <w:rPr>
                 <w:rStyle w:val="Hyperlink"/>
@@ -616,7 +615,7 @@
                 <w:noProof/>
                 <w:webHidden/>
               </w:rPr>
-              <w:instrText xml:space="preserve"> PAGEREF _Toc237640590 \h </w:instrText>
+              <w:instrText xml:space="preserve"> PAGEREF _Toc237642968 \h </w:instrText>
             </w:r>
             <w:r>
               <w:rPr>
@@ -636,7 +635,7 @@
                 <w:noProof/>
                 <w:webHidden/>
               </w:rPr>
-              <w:t>8</w:t>
+              <w:t>9</w:t>
             </w:r>
             <w:r>
               <w:rPr>
@@ -659,7 +658,7 @@
               <w:lang w:eastAsia="en-ZA"/>
             </w:rPr>
           </w:pPr>
-          <w:hyperlink w:anchor="_Toc237640591" w:history="1">
+          <w:hyperlink w:anchor="_Toc237642969" w:history="1">
             <w:r>
               <w:rPr>
                 <w:rStyle w:val="Hyperlink"/>
@@ -686,7 +685,7 @@
                 <w:noProof/>
                 <w:webHidden/>
               </w:rPr>
-              <w:instrText xml:space="preserve"> PAGEREF _Toc237640591 \h </w:instrText>
+              <w:instrText xml:space="preserve"> PAGEREF _Toc237642969 \h </w:instrText>
             </w:r>
             <w:r>
               <w:rPr>
@@ -706,7 +705,7 @@
                 <w:noProof/>
                 <w:webHidden/>
               </w:rPr>
-              <w:t>8</w:t>
+              <w:t>9</w:t>
             </w:r>
             <w:r>
               <w:rPr>
@@ -729,7 +728,7 @@
               <w:lang w:eastAsia="en-ZA"/>
             </w:rPr>
           </w:pPr>
-          <w:hyperlink w:anchor="_Toc237640592" w:history="1">
+          <w:hyperlink w:anchor="_Toc237642970" w:history="1">
             <w:r>
               <w:rPr>
                 <w:rStyle w:val="Hyperlink"/>
@@ -756,7 +755,7 @@
                 <w:noProof/>
                 <w:webHidden/>
               </w:rPr>
-              <w:instrText xml:space="preserve"> PAGEREF _Toc237640592 \h </w:instrText>
+              <w:instrText xml:space="preserve"> PAGEREF _Toc237642970 \h </w:instrText>
             </w:r>
             <w:r>
               <w:rPr>
@@ -776,7 +775,7 @@
                 <w:noProof/>
                 <w:webHidden/>
               </w:rPr>
-              <w:t>9</w:t>
+              <w:t>10</w:t>
             </w:r>
             <w:r>
               <w:rPr>
@@ -799,7 +798,7 @@
               <w:lang w:eastAsia="en-ZA"/>
             </w:rPr>
           </w:pPr>
-          <w:hyperlink w:anchor="_Toc237640593" w:history="1">
+          <w:hyperlink w:anchor="_Toc237642971" w:history="1">
             <w:r>
               <w:rPr>
                 <w:rStyle w:val="Hyperlink"/>
@@ -826,7 +825,7 @@
                 <w:noProof/>
                 <w:webHidden/>
               </w:rPr>
-              <w:instrText xml:space="preserve"> PAGEREF _Toc237640593 \h </w:instrText>
+              <w:instrText xml:space="preserve"> PAGEREF _Toc237642971 \h </w:instrText>
             </w:r>
             <w:r>
               <w:rPr>
@@ -846,7 +845,7 @@
                 <w:noProof/>
                 <w:webHidden/>
               </w:rPr>
-              <w:t>9</w:t>
+              <w:t>10</w:t>
             </w:r>
             <w:r>
               <w:rPr>
@@ -877,7 +876,7 @@
     <w:p/>
     <w:p/>
     <w:p>
-      <w:bookmarkStart w:id="0" w:name="_Toc237640585"/>
+      <w:bookmarkStart w:id="0" w:name="_Toc237642963"/>
       <w:r>
         <w:rPr>
           <w:rStyle w:val="Heading1Char"/>
@@ -976,7 +975,7 @@
       <w:pPr>
         <w:pStyle w:val="Heading1"/>
       </w:pPr>
-      <w:bookmarkStart w:id="1" w:name="_Toc237640586"/>
+      <w:bookmarkStart w:id="1" w:name="_Toc237642964"/>
       <w:r>
         <w:t>2. Website Goals and Objectives</w:t>
       </w:r>
@@ -1070,7 +1069,7 @@
       </w:pPr>
     </w:p>
     <w:p>
-      <w:bookmarkStart w:id="2" w:name="_Toc237640587"/>
+      <w:bookmarkStart w:id="2" w:name="_Toc237642965"/>
       <w:r>
         <w:rPr>
           <w:rStyle w:val="Heading1Char"/>
@@ -1093,7 +1092,7 @@
       <w:pPr>
         <w:pStyle w:val="Heading1"/>
       </w:pPr>
-      <w:bookmarkStart w:id="3" w:name="_Toc237640588"/>
+      <w:bookmarkStart w:id="3" w:name="_Toc237642966"/>
       <w:r>
         <w:t>4. Proposed Website Features and Functionality</w:t>
       </w:r>
@@ -1231,7 +1230,7 @@
       <w:pPr>
         <w:pStyle w:val="Heading1"/>
       </w:pPr>
-      <w:bookmarkStart w:id="4" w:name="_Toc237640589"/>
+      <w:bookmarkStart w:id="4" w:name="_Toc237642967"/>
       <w:r>
         <w:t>5. Design and User Experience</w:t>
       </w:r>
@@ -1303,6 +1302,104 @@
       </w:r>
     </w:p>
     <w:p>
+      <w:pPr>
+        <w:ind w:left="360"/>
+      </w:pPr>
+      <w:r>
+        <w:rPr>
+          <w:noProof/>
+        </w:rPr>
+        <w:lastRenderedPageBreak/>
+        <w:drawing>
+          <wp:inline distT="0" distB="0" distL="0" distR="0" wp14:anchorId="61A0AC8B" wp14:editId="428766C0">
+            <wp:extent cx="5731510" cy="4382770"/>
+            <wp:effectExtent l="0" t="0" r="0" b="0"/>
+            <wp:docPr id="792910371" name="Picture 1"/>
+            <wp:cNvGraphicFramePr>
+              <a:graphicFrameLocks xmlns:a="http://schemas.openxmlformats.org/drawingml/2006/main" noChangeAspect="1"/>
+            </wp:cNvGraphicFramePr>
+            <a:graphic xmlns:a="http://schemas.openxmlformats.org/drawingml/2006/main">
+              <a:graphicData uri="http://schemas.openxmlformats.org/drawingml/2006/picture">
+                <pic:pic xmlns:pic="http://schemas.openxmlformats.org/drawingml/2006/picture">
+                  <pic:nvPicPr>
+                    <pic:cNvPr id="792910371" name="Picture 792910371"/>
+                    <pic:cNvPicPr/>
+                  </pic:nvPicPr>
+                  <pic:blipFill>
+                    <a:blip r:embed="rId7" cstate="print">
+                      <a:extLst>
+                        <a:ext uri="{28A0092B-C50C-407E-A947-70E740481C1C}">
+                          <a14:useLocalDpi xmlns:a14="http://schemas.microsoft.com/office/drawing/2010/main" val="0"/>
+                        </a:ext>
+                      </a:extLst>
+                    </a:blip>
+                    <a:stretch>
+                      <a:fillRect/>
+                    </a:stretch>
+                  </pic:blipFill>
+                  <pic:spPr>
+                    <a:xfrm>
+                      <a:off x="0" y="0"/>
+                      <a:ext cx="5731510" cy="4382770"/>
+                    </a:xfrm>
+                    <a:prstGeom prst="rect">
+                      <a:avLst/>
+                    </a:prstGeom>
+                  </pic:spPr>
+                </pic:pic>
+              </a:graphicData>
+            </a:graphic>
+          </wp:inline>
+        </w:drawing>
+      </w:r>
+      <w:r>
+        <w:rPr>
+          <w:noProof/>
+        </w:rPr>
+        <w:drawing>
+          <wp:inline distT="0" distB="0" distL="0" distR="0" wp14:anchorId="3090B83D" wp14:editId="6956D071">
+            <wp:extent cx="5731510" cy="1989455"/>
+            <wp:effectExtent l="0" t="0" r="0" b="0"/>
+            <wp:docPr id="1298849930" name="Picture 2"/>
+            <wp:cNvGraphicFramePr>
+              <a:graphicFrameLocks xmlns:a="http://schemas.openxmlformats.org/drawingml/2006/main" noChangeAspect="1"/>
+            </wp:cNvGraphicFramePr>
+            <a:graphic xmlns:a="http://schemas.openxmlformats.org/drawingml/2006/main">
+              <a:graphicData uri="http://schemas.openxmlformats.org/drawingml/2006/picture">
+                <pic:pic xmlns:pic="http://schemas.openxmlformats.org/drawingml/2006/picture">
+                  <pic:nvPicPr>
+                    <pic:cNvPr id="1298849930" name="Picture 1298849930"/>
+                    <pic:cNvPicPr/>
+                  </pic:nvPicPr>
+                  <pic:blipFill>
+                    <a:blip r:embed="rId8" cstate="print">
+                      <a:extLst>
+                        <a:ext uri="{28A0092B-C50C-407E-A947-70E740481C1C}">
+                          <a14:useLocalDpi xmlns:a14="http://schemas.microsoft.com/office/drawing/2010/main" val="0"/>
+                        </a:ext>
+                      </a:extLst>
+                    </a:blip>
+                    <a:stretch>
+                      <a:fillRect/>
+                    </a:stretch>
+                  </pic:blipFill>
+                  <pic:spPr>
+                    <a:xfrm>
+                      <a:off x="0" y="0"/>
+                      <a:ext cx="5731510" cy="1989455"/>
+                    </a:xfrm>
+                    <a:prstGeom prst="rect">
+                      <a:avLst/>
+                    </a:prstGeom>
+                  </pic:spPr>
+                </pic:pic>
+              </a:graphicData>
+            </a:graphic>
+          </wp:inline>
+        </w:drawing>
+      </w:r>
+    </w:p>
+    <w:p>
       <w:r>
         <w:br w:type="page"/>
       </w:r>
@@ -1313,7 +1410,7 @@
       </w:pPr>
     </w:p>
     <w:p>
-      <w:bookmarkStart w:id="5" w:name="_Toc237640590"/>
+      <w:bookmarkStart w:id="5" w:name="_Toc237642968"/>
       <w:r>
         <w:rPr>
           <w:rStyle w:val="Heading1Char"/>
@@ -1346,7 +1443,7 @@
       <w:pPr>
         <w:pStyle w:val="Heading1"/>
       </w:pPr>
-      <w:bookmarkStart w:id="6" w:name="_Toc237640591"/>
+      <w:bookmarkStart w:id="6" w:name="_Toc237642969"/>
       <w:r>
         <w:t>7. Timeline and Milestones</w:t>
       </w:r>
@@ -1407,7 +1504,7 @@
       </w:pPr>
     </w:p>
     <w:p>
-      <w:bookmarkStart w:id="7" w:name="_Toc237640592"/>
+      <w:bookmarkStart w:id="7" w:name="_Toc237642970"/>
       <w:r>
         <w:rPr>
           <w:rStyle w:val="Heading1Char"/>
@@ -1421,7 +1518,7 @@
       </w:r>
     </w:p>
     <w:p>
-      <w:bookmarkStart w:id="8" w:name="_Toc237640593"/>
+      <w:bookmarkStart w:id="8" w:name="_Toc237642971"/>
       <w:r>
         <w:rPr>
           <w:rStyle w:val="Heading1Char"/>
@@ -1443,7 +1540,7 @@
       <w:r>
         <w:t xml:space="preserve">. Available at: </w:t>
       </w:r>
-      <w:hyperlink r:id="rId7" w:history="1">
+      <w:hyperlink r:id="rId9" w:history="1">
         <w:r>
           <w:rPr>
             <w:rStyle w:val="Hyperlink"/>
@@ -1475,7 +1572,7 @@
       <w:r>
         <w:t xml:space="preserve">. Available at: </w:t>
       </w:r>
-      <w:hyperlink r:id="rId8" w:history="1">
+      <w:hyperlink r:id="rId10" w:history="1">
         <w:r>
           <w:rPr>
             <w:rStyle w:val="Hyperlink"/>
@@ -1507,7 +1604,7 @@
       <w:r>
         <w:t xml:space="preserve">. Available at: </w:t>
       </w:r>
-      <w:hyperlink r:id="rId9" w:history="1">
+      <w:hyperlink r:id="rId11" w:history="1">
         <w:r>
           <w:rPr>
             <w:rStyle w:val="Hyperlink"/>
@@ -2898,6 +2995,7 @@
   <w:style w:type="character" w:default="1" w:styleId="DefaultParagraphFont">
     <w:name w:val="Default Paragraph Font"/>
     <w:uiPriority w:val="1"/>
+    <w:semiHidden/>
     <w:unhideWhenUsed/>
   </w:style>
   <w:style w:type="table" w:default="1" w:styleId="TableNormal">

</xml_diff>